<commit_message>
Add service-driven record flows with routing, detail view, and history timeline (mock-backed)
</commit_message>
<xml_diff>
--- a/designDoc.docx
+++ b/designDoc.docx
@@ -50,8 +50,13 @@
         </w:numPr>
       </w:pPr>
       <w:r>
-        <w:t>modular Angular architecture</w:t>
-      </w:r>
+        <w:t xml:space="preserve">modular Angular </w:t>
+      </w:r>
+      <w:proofErr w:type="gramStart"/>
+      <w:r>
+        <w:t>architecture</w:t>
+      </w:r>
+      <w:proofErr w:type="gramEnd"/>
     </w:p>
     <w:p>
       <w:pPr>
@@ -200,8 +205,13 @@
           <w:numId w:val="2"/>
         </w:numPr>
       </w:pPr>
-      <w:r>
-        <w:t>compare an old payload and new payload in a structured diff-oriented interface</w:t>
+      <w:proofErr w:type="gramStart"/>
+      <w:r>
+        <w:t>compare</w:t>
+      </w:r>
+      <w:proofErr w:type="gramEnd"/>
+      <w:r>
+        <w:t xml:space="preserve"> an old payload and new payload in a structured diff-oriented interface</w:t>
       </w:r>
     </w:p>
     <w:p>
@@ -413,7 +423,15 @@
     </w:p>
     <w:p>
       <w:r>
-        <w:t>Use local mock JSON files or an in-app mock service first so the architecture can be proven quickly. If needed later, replace with a lightweight mock API without changing component contracts.</w:t>
+        <w:t xml:space="preserve">Use local mock JSON files or an in-app mock service first so the architecture can be proven quickly. If needed later, </w:t>
+      </w:r>
+      <w:proofErr w:type="gramStart"/>
+      <w:r>
+        <w:t>replace</w:t>
+      </w:r>
+      <w:proofErr w:type="gramEnd"/>
+      <w:r>
+        <w:t xml:space="preserve"> with a lightweight mock API without changing component contracts.</w:t>
       </w:r>
     </w:p>
     <w:p>
@@ -596,7 +614,15 @@
     </w:p>
     <w:p>
       <w:r>
-        <w:t xml:space="preserve">        empty-state/</w:t>
+        <w:t xml:space="preserve">        </w:t>
+      </w:r>
+      <w:proofErr w:type="gramStart"/>
+      <w:r>
+        <w:t>empty-state</w:t>
+      </w:r>
+      <w:proofErr w:type="gramEnd"/>
+      <w:r>
+        <w:t>/</w:t>
       </w:r>
     </w:p>
     <w:p>
@@ -636,7 +662,15 @@
     </w:p>
     <w:p>
       <w:r>
-        <w:t xml:space="preserve">          record-list/</w:t>
+        <w:t xml:space="preserve">          </w:t>
+      </w:r>
+      <w:proofErr w:type="gramStart"/>
+      <w:r>
+        <w:t>record-list</w:t>
+      </w:r>
+      <w:proofErr w:type="gramEnd"/>
+      <w:r>
+        <w:t>/</w:t>
       </w:r>
     </w:p>
     <w:p>
@@ -693,8 +727,13 @@
         <w:t xml:space="preserve">    </w:t>
       </w:r>
       <w:proofErr w:type="spellStart"/>
-      <w:r>
-        <w:t>app.routes.ts</w:t>
+      <w:proofErr w:type="gramStart"/>
+      <w:r>
+        <w:t>app.routes</w:t>
+      </w:r>
+      <w:proofErr w:type="gramEnd"/>
+      <w:r>
+        <w:t>.ts</w:t>
       </w:r>
       <w:proofErr w:type="spellEnd"/>
     </w:p>
@@ -994,8 +1033,13 @@
           <w:numId w:val="7"/>
         </w:numPr>
       </w:pPr>
-      <w:r>
-        <w:t>notes?: string</w:t>
+      <w:proofErr w:type="gramStart"/>
+      <w:r>
+        <w:t>notes?:</w:t>
+      </w:r>
+      <w:proofErr w:type="gramEnd"/>
+      <w:r>
+        <w:t xml:space="preserve"> string</w:t>
       </w:r>
     </w:p>
     <w:p>
@@ -1005,7 +1049,6 @@
           <w:bCs/>
         </w:rPr>
       </w:pPr>
-      <w:proofErr w:type="spellStart"/>
       <w:r>
         <w:rPr>
           <w:b/>
@@ -1013,25 +1056,67 @@
         </w:rPr>
         <w:t>TableColumnConfig</w:t>
       </w:r>
+    </w:p>
+    <w:p>
+      <w:r>
+        <w:t xml:space="preserve">Used by the reusable </w:t>
+      </w:r>
+      <w:proofErr w:type="spellStart"/>
+      <w:r>
+        <w:t>datatable</w:t>
+      </w:r>
       <w:proofErr w:type="spellEnd"/>
-    </w:p>
-    <w:p>
-      <w:r>
-        <w:t xml:space="preserve">Used by the reusable </w:t>
+      <w:r>
+        <w:t>.</w:t>
+      </w:r>
+    </w:p>
+    <w:p>
+      <w:r>
+        <w:t>Suggested fields:</w:t>
+      </w:r>
+    </w:p>
+    <w:p>
+      <w:pPr>
+        <w:numPr>
+          <w:ilvl w:val="0"/>
+          <w:numId w:val="8"/>
+        </w:numPr>
+      </w:pPr>
+      <w:r>
+        <w:t>key: string</w:t>
+      </w:r>
+    </w:p>
+    <w:p>
+      <w:pPr>
+        <w:numPr>
+          <w:ilvl w:val="0"/>
+          <w:numId w:val="8"/>
+        </w:numPr>
+      </w:pPr>
+      <w:r>
+        <w:t>label: string</w:t>
+      </w:r>
+    </w:p>
+    <w:p>
+      <w:pPr>
+        <w:numPr>
+          <w:ilvl w:val="0"/>
+          <w:numId w:val="8"/>
+        </w:numPr>
+      </w:pPr>
+      <w:proofErr w:type="gramStart"/>
+      <w:r>
+        <w:t>sortable?:</w:t>
+      </w:r>
+      <w:proofErr w:type="gramEnd"/>
+      <w:r>
+        <w:t xml:space="preserve"> </w:t>
       </w:r>
       <w:proofErr w:type="spellStart"/>
       <w:r>
-        <w:t>datatable</w:t>
+        <w:t>boolean</w:t>
       </w:r>
       <w:proofErr w:type="spellEnd"/>
-      <w:r>
-        <w:t>.</w:t>
-      </w:r>
-    </w:p>
-    <w:p>
-      <w:r>
-        <w:t>Suggested fields:</w:t>
-      </w:r>
     </w:p>
     <w:p>
       <w:pPr>
@@ -1040,9 +1125,19 @@
           <w:numId w:val="8"/>
         </w:numPr>
       </w:pPr>
-      <w:r>
-        <w:t>key: string</w:t>
-      </w:r>
+      <w:proofErr w:type="gramStart"/>
+      <w:r>
+        <w:t>searchable?:</w:t>
+      </w:r>
+      <w:proofErr w:type="gramEnd"/>
+      <w:r>
+        <w:t xml:space="preserve"> </w:t>
+      </w:r>
+      <w:proofErr w:type="spellStart"/>
+      <w:r>
+        <w:t>boolean</w:t>
+      </w:r>
+      <w:proofErr w:type="spellEnd"/>
     </w:p>
     <w:p>
       <w:pPr>
@@ -1051,8 +1146,13 @@
           <w:numId w:val="8"/>
         </w:numPr>
       </w:pPr>
-      <w:r>
-        <w:t>label: string</w:t>
+      <w:proofErr w:type="gramStart"/>
+      <w:r>
+        <w:t>width?:</w:t>
+      </w:r>
+      <w:proofErr w:type="gramEnd"/>
+      <w:r>
+        <w:t xml:space="preserve"> string</w:t>
       </w:r>
     </w:p>
     <w:p>
@@ -1062,51 +1162,13 @@
           <w:numId w:val="8"/>
         </w:numPr>
       </w:pPr>
-      <w:r>
-        <w:t xml:space="preserve">sortable?: </w:t>
-      </w:r>
-      <w:proofErr w:type="spellStart"/>
-      <w:r>
-        <w:t>boolean</w:t>
-      </w:r>
-      <w:proofErr w:type="spellEnd"/>
-    </w:p>
-    <w:p>
-      <w:pPr>
-        <w:numPr>
-          <w:ilvl w:val="0"/>
-          <w:numId w:val="8"/>
-        </w:numPr>
-      </w:pPr>
-      <w:r>
-        <w:t xml:space="preserve">searchable?: </w:t>
-      </w:r>
-      <w:proofErr w:type="spellStart"/>
-      <w:r>
-        <w:t>boolean</w:t>
-      </w:r>
-      <w:proofErr w:type="spellEnd"/>
-    </w:p>
-    <w:p>
-      <w:pPr>
-        <w:numPr>
-          <w:ilvl w:val="0"/>
-          <w:numId w:val="8"/>
-        </w:numPr>
-      </w:pPr>
-      <w:r>
-        <w:t>width?: string</w:t>
-      </w:r>
-    </w:p>
-    <w:p>
-      <w:pPr>
-        <w:numPr>
-          <w:ilvl w:val="0"/>
-          <w:numId w:val="8"/>
-        </w:numPr>
-      </w:pPr>
-      <w:r>
-        <w:t>formatter?: function</w:t>
+      <w:proofErr w:type="gramStart"/>
+      <w:r>
+        <w:t>formatter?:</w:t>
+      </w:r>
+      <w:proofErr w:type="gramEnd"/>
+      <w:r>
+        <w:t xml:space="preserve"> function</w:t>
       </w:r>
     </w:p>
     <w:p>
@@ -1173,8 +1235,13 @@
           <w:numId w:val="9"/>
         </w:numPr>
       </w:pPr>
-      <w:r>
-        <w:t>keep lightweight</w:t>
+      <w:proofErr w:type="gramStart"/>
+      <w:r>
+        <w:t>keep</w:t>
+      </w:r>
+      <w:proofErr w:type="gramEnd"/>
+      <w:r>
+        <w:t xml:space="preserve"> lightweight</w:t>
       </w:r>
     </w:p>
     <w:p>
@@ -1264,8 +1331,13 @@
         </w:numPr>
       </w:pPr>
       <w:r>
-        <w:t>/records</w:t>
-      </w:r>
+        <w:t>/</w:t>
+      </w:r>
+      <w:proofErr w:type="gramStart"/>
+      <w:r>
+        <w:t>records</w:t>
+      </w:r>
+      <w:proofErr w:type="gramEnd"/>
     </w:p>
     <w:p>
       <w:pPr>
@@ -1375,8 +1447,13 @@
           <w:numId w:val="15"/>
         </w:numPr>
       </w:pPr>
-      <w:r>
-        <w:t>compare old vs new payloads for a timeline event</w:t>
+      <w:proofErr w:type="gramStart"/>
+      <w:r>
+        <w:t>compare</w:t>
+      </w:r>
+      <w:proofErr w:type="gramEnd"/>
+      <w:r>
+        <w:t xml:space="preserve"> old vs new payloads for a timeline event</w:t>
       </w:r>
     </w:p>
     <w:p>
@@ -1414,13 +1491,18 @@
         </w:numPr>
       </w:pPr>
       <w:r>
-        <w:t>/records/:id/history/:</w:t>
+        <w:t>/records/:id/history</w:t>
+      </w:r>
+      <w:proofErr w:type="gramStart"/>
+      <w:r>
+        <w:t>/:</w:t>
       </w:r>
       <w:proofErr w:type="spellStart"/>
       <w:r>
         <w:t>historyId</w:t>
       </w:r>
       <w:proofErr w:type="spellEnd"/>
+      <w:proofErr w:type="gramEnd"/>
     </w:p>
     <w:p>
       <w:pPr>
@@ -1808,8 +1890,13 @@
         </w:numPr>
       </w:pPr>
       <w:r>
-        <w:t>initial version can be read-only pretty print</w:t>
-      </w:r>
+        <w:t xml:space="preserve">initial version can be read-only </w:t>
+      </w:r>
+      <w:proofErr w:type="gramStart"/>
+      <w:r>
+        <w:t>pretty print</w:t>
+      </w:r>
+      <w:proofErr w:type="gramEnd"/>
     </w:p>
     <w:p>
       <w:pPr>
@@ -1839,8 +1926,13 @@
           <w:numId w:val="25"/>
         </w:numPr>
       </w:pPr>
-      <w:r>
-        <w:t>compare old/new payloads</w:t>
+      <w:proofErr w:type="gramStart"/>
+      <w:r>
+        <w:t>compare</w:t>
+      </w:r>
+      <w:proofErr w:type="gramEnd"/>
+      <w:r>
+        <w:t xml:space="preserve"> old/new payloads</w:t>
       </w:r>
     </w:p>
     <w:p>
@@ -1968,12 +2060,17 @@
         </w:numPr>
       </w:pPr>
       <w:proofErr w:type="spellStart"/>
+      <w:proofErr w:type="gramStart"/>
       <w:r>
         <w:t>getRecords</w:t>
       </w:r>
       <w:proofErr w:type="spellEnd"/>
       <w:r>
-        <w:t>()</w:t>
+        <w:t>(</w:t>
+      </w:r>
+      <w:proofErr w:type="gramEnd"/>
+      <w:r>
+        <w:t>)</w:t>
       </w:r>
     </w:p>
     <w:p>
@@ -1984,12 +2081,17 @@
         </w:numPr>
       </w:pPr>
       <w:proofErr w:type="spellStart"/>
+      <w:proofErr w:type="gramStart"/>
       <w:r>
         <w:t>getRecordById</w:t>
       </w:r>
       <w:proofErr w:type="spellEnd"/>
       <w:r>
-        <w:t>(id: string)</w:t>
+        <w:t>(</w:t>
+      </w:r>
+      <w:proofErr w:type="gramEnd"/>
+      <w:r>
+        <w:t>id: string)</w:t>
       </w:r>
     </w:p>
     <w:p>
@@ -2000,6 +2102,7 @@
         </w:numPr>
       </w:pPr>
       <w:proofErr w:type="spellStart"/>
+      <w:proofErr w:type="gramStart"/>
       <w:r>
         <w:t>getRecordHistory</w:t>
       </w:r>
@@ -2008,6 +2111,7 @@
         <w:t>(</w:t>
       </w:r>
       <w:proofErr w:type="spellStart"/>
+      <w:proofErr w:type="gramEnd"/>
       <w:r>
         <w:t>recordId</w:t>
       </w:r>
@@ -2125,8 +2229,21 @@
           <w:numId w:val="29"/>
         </w:numPr>
       </w:pPr>
-      <w:r>
-        <w:t>component-local derived state when simple</w:t>
+      <w:proofErr w:type="gramStart"/>
+      <w:r>
+        <w:t>component</w:t>
+      </w:r>
+      <w:proofErr w:type="gramEnd"/>
+      <w:r>
+        <w:t xml:space="preserve">-local derived </w:t>
+      </w:r>
+      <w:proofErr w:type="gramStart"/>
+      <w:r>
+        <w:t>state</w:t>
+      </w:r>
+      <w:proofErr w:type="gramEnd"/>
+      <w:r>
+        <w:t xml:space="preserve"> when simple</w:t>
       </w:r>
     </w:p>
     <w:p>
@@ -2739,8 +2856,13 @@
           <w:numId w:val="36"/>
         </w:numPr>
       </w:pPr>
-      <w:r>
-        <w:t>generate typed interfaces from sample JSON</w:t>
+      <w:proofErr w:type="gramStart"/>
+      <w:r>
+        <w:t>generate</w:t>
+      </w:r>
+      <w:proofErr w:type="gramEnd"/>
+      <w:r>
+        <w:t xml:space="preserve"> typed interfaces from sample JSON</w:t>
       </w:r>
     </w:p>
     <w:p>
@@ -2883,8 +3005,13 @@
           <w:numId w:val="37"/>
         </w:numPr>
       </w:pPr>
-      <w:r>
-        <w:t>what gets deferred vs built now</w:t>
+      <w:proofErr w:type="gramStart"/>
+      <w:r>
+        <w:t>what</w:t>
+      </w:r>
+      <w:proofErr w:type="gramEnd"/>
+      <w:r>
+        <w:t xml:space="preserve"> gets deferred vs built now</w:t>
       </w:r>
     </w:p>
     <w:p>
@@ -10712,6 +10839,7 @@
   <w:style w:type="character" w:default="1" w:styleId="DefaultParagraphFont">
     <w:name w:val="Default Paragraph Font"/>
     <w:uiPriority w:val="1"/>
+    <w:semiHidden/>
     <w:unhideWhenUsed/>
   </w:style>
   <w:style w:type="table" w:default="1" w:styleId="TableNormal">

</xml_diff>